<commit_message>
chore: update template output defaults
</commit_message>
<xml_diff>
--- a/BackEnd/templates/example_contract/template.docx
+++ b/BackEnd/templates/example_contract/template.docx
@@ -1,126 +1,436 @@
 
 <file path=word/document.xml><?xml version="1.0" encoding="utf-8"?>
-<w:document xmlns:ve="http://schemas.openxmlformats.org/markup-compatibility/2006" xmlns:o="urn:schemas-microsoft-com:office:office" xmlns:r="http://schemas.openxmlformats.org/officeDocument/2006/relationships" xmlns:v="urn:schemas-microsoft-com:vml" xmlns:wp="http://schemas.openxmlformats.org/drawingml/2006/wordprocessingDrawing" xmlns:w10="urn:schemas-microsoft-com:office:word" xmlns:w="http://schemas.openxmlformats.org/wordprocessingml/2006/main">
+<w:document xmlns:wpc="http://schemas.microsoft.com/office/word/2010/wordprocessingCanvas" xmlns:mc="http://schemas.openxmlformats.org/markup-compatibility/2006" xmlns:o="urn:schemas-microsoft-com:office:office" xmlns:r="http://schemas.openxmlformats.org/officeDocument/2006/relationships" xmlns:m="http://schemas.openxmlformats.org/officeDocument/2006/math" xmlns:v="urn:schemas-microsoft-com:vml" xmlns:wp14="http://schemas.microsoft.com/office/word/2010/wordprocessingDrawing" xmlns:wp="http://schemas.openxmlformats.org/drawingml/2006/wordprocessingDrawing" xmlns:w="http://schemas.openxmlformats.org/wordprocessingml/2006/main" xmlns:w14="http://schemas.microsoft.com/office/word/2010/wordml" xmlns:w10="urn:schemas-microsoft-com:office:word" xmlns:w15="http://schemas.microsoft.com/office/word/2012/wordml" xmlns:wpg="http://schemas.microsoft.com/office/word/2010/wordprocessingGroup" xmlns:wpi="http://schemas.microsoft.com/office/word/2010/wordprocessingInk" xmlns:wne="http://schemas.microsoft.com/office/word/2006/wordml" xmlns:wps="http://schemas.microsoft.com/office/word/2010/wordprocessingShape" xmlns:wpsCustomData="http://www.wps.cn/officeDocument/2013/wpsCustomData" mc:Ignorable="w14 w15 wp14">
   <w:body>
     <w:p>
       <w:pPr>
+        <w:spacing w:after="321"/>
         <w:jc w:val="center"/>
-        <w:spacing w:after="321"/>
+        <w:rPr>
+          <w:highlight w:val="red"/>
+        </w:rPr>
       </w:pPr>
       <w:r>
         <w:rPr>
           <w:rFonts w:ascii="Helvetica" w:hAnsi="Helvetica" w:cs="Helvetica"/>
+          <w:b/>
+          <w:spacing w:val="0"/>
           <w:sz w:val="48"/>
-          <w:sz-cs w:val="48"/>
-          <w:b/>
-          <w:spacing w:val="0"/>
-        </w:rPr>
-        <w:t xml:space="preserve">示例合同</w:t>
+          <w:highlight w:val="red"/>
+        </w:rPr>
+        <w:t>示例合同</w:t>
       </w:r>
     </w:p>
     <w:p>
-      <w:pPr/>
-      <w:r>
-        <w:rPr>
-          <w:rFonts w:ascii="Helvetica" w:hAnsi="Helvetica" w:cs="Helvetica"/>
-          <w:sz w:val="24"/>
-          <w:sz-cs w:val="24"/>
+      <w:r>
+        <w:rPr>
+          <w:rFonts w:ascii="Helvetica" w:hAnsi="Helvetica" w:cs="Helvetica"/>
           <w:b/>
           <w:spacing w:val="0"/>
-        </w:rPr>
-        <w:t xml:space="preserve">甲方（Party A）：</w:t>
-      </w:r>
-      <w:r>
-        <w:rPr>
-          <w:rFonts w:ascii="Helvetica" w:hAnsi="Helvetica" w:cs="Helvetica"/>
-          <w:sz w:val="24"/>
-          <w:sz-cs w:val="24"/>
-          <w:spacing w:val="0"/>
-        </w:rPr>
-        <w:t xml:space="preserve"> {{ party_a_name }}</w:t>
+          <w:sz w:val="24"/>
+        </w:rPr>
+        <w:t>甲方（Party A）：</w:t>
+      </w:r>
+      <w:r>
+        <w:rPr>
+          <w:rFonts w:ascii="Helvetica" w:hAnsi="Helvetica" w:cs="Helvetica"/>
+          <w:spacing w:val="0"/>
+          <w:sz w:val="24"/>
+        </w:rPr>
+        <w:t xml:space="preserve"> </w:t>
+      </w:r>
+      <w:r>
+        <w:rPr>
+          <w:rFonts w:ascii="Helvetica" w:hAnsi="Helvetica" w:cs="Helvetica"/>
+          <w:color w:val="0000FF"/>
+          <w:spacing w:val="0"/>
+          <w:sz w:val="24"/>
+        </w:rPr>
+        <w:t>{{ party_a_name }}</w:t>
       </w:r>
     </w:p>
     <w:p>
-      <w:pPr/>
-      <w:r>
-        <w:rPr>
-          <w:rFonts w:ascii="Helvetica" w:hAnsi="Helvetica" w:cs="Helvetica"/>
-          <w:sz w:val="24"/>
-          <w:sz-cs w:val="24"/>
+      <w:r>
+        <w:rPr>
+          <w:rFonts w:ascii="Helvetica" w:hAnsi="Helvetica" w:cs="Helvetica"/>
           <w:b/>
           <w:spacing w:val="0"/>
-        </w:rPr>
-        <w:t xml:space="preserve">乙方（Party B）：</w:t>
-      </w:r>
-      <w:r>
-        <w:rPr>
-          <w:rFonts w:ascii="Helvetica" w:hAnsi="Helvetica" w:cs="Helvetica"/>
-          <w:sz w:val="24"/>
-          <w:sz-cs w:val="24"/>
-          <w:spacing w:val="0"/>
-        </w:rPr>
-        <w:t xml:space="preserve"> {{ party_b_name }}</w:t>
+          <w:sz w:val="24"/>
+        </w:rPr>
+        <w:t>乙方（Party B）：</w:t>
+      </w:r>
+      <w:r>
+        <w:rPr>
+          <w:rFonts w:ascii="Helvetica" w:hAnsi="Helvetica" w:cs="Helvetica"/>
+          <w:spacing w:val="0"/>
+          <w:sz w:val="24"/>
+        </w:rPr>
+        <w:t xml:space="preserve"> </w:t>
+      </w:r>
+      <w:r>
+        <w:rPr>
+          <w:rFonts w:hint="default" w:ascii="Helvetica Bold" w:hAnsi="Helvetica Bold" w:cs="Helvetica Bold"/>
+          <w:b/>
+          <w:bCs/>
+          <w:spacing w:val="0"/>
+          <w:sz w:val="24"/>
+        </w:rPr>
+        <w:t>{{ party_b_name }}</w:t>
       </w:r>
     </w:p>
     <w:p>
-      <w:pPr/>
-      <w:r>
-        <w:rPr>
-          <w:rFonts w:ascii="Helvetica" w:hAnsi="Helvetica" w:cs="Helvetica"/>
-          <w:sz w:val="24"/>
-          <w:sz-cs w:val="24"/>
+      <w:r>
+        <w:rPr>
+          <w:rFonts w:ascii="Helvetica" w:hAnsi="Helvetica" w:cs="Helvetica"/>
           <w:b/>
           <w:spacing w:val="0"/>
-        </w:rPr>
-        <w:t xml:space="preserve">签署日期：</w:t>
-      </w:r>
-      <w:r>
-        <w:rPr>
-          <w:rFonts w:ascii="Helvetica" w:hAnsi="Helvetica" w:cs="Helvetica"/>
-          <w:sz w:val="24"/>
-          <w:sz-cs w:val="24"/>
-          <w:spacing w:val="0"/>
+          <w:sz w:val="24"/>
+        </w:rPr>
+        <w:t>签署日期：</w:t>
+      </w:r>
+      <w:r>
+        <w:rPr>
+          <w:rFonts w:ascii="Helvetica" w:hAnsi="Helvetica" w:cs="Helvetica"/>
+          <w:spacing w:val="0"/>
+          <w:sz w:val="24"/>
         </w:rPr>
         <w:t xml:space="preserve"> {{ sign_date }}</w:t>
       </w:r>
     </w:p>
     <w:p>
-      <w:pPr/>
-      <w:r>
-        <w:rPr>
-          <w:rFonts w:ascii="Helvetica" w:hAnsi="Helvetica" w:cs="Helvetica"/>
-          <w:sz w:val="24"/>
-          <w:sz-cs w:val="24"/>
+      <w:r>
+        <w:rPr>
+          <w:rFonts w:ascii="Helvetica" w:hAnsi="Helvetica" w:cs="Helvetica"/>
           <w:b/>
           <w:spacing w:val="0"/>
-        </w:rPr>
-        <w:t xml:space="preserve">保密条款：</w:t>
-      </w:r>
-      <w:r>
-        <w:rPr>
-          <w:rFonts w:ascii="Helvetica" w:hAnsi="Helvetica" w:cs="Helvetica"/>
-          <w:sz w:val="24"/>
-          <w:sz-cs w:val="24"/>
-          <w:spacing w:val="0"/>
+          <w:sz w:val="24"/>
+        </w:rPr>
+        <w:t>保密条款：</w:t>
+      </w:r>
+      <w:r>
+        <w:rPr>
+          <w:rFonts w:ascii="Helvetica" w:hAnsi="Helvetica" w:cs="Helvetica"/>
+          <w:spacing w:val="0"/>
+          <w:sz w:val="24"/>
         </w:rPr>
         <w:t xml:space="preserve"> {% if is_confidential %}启用{% else %}未启用{% endif %}</w:t>
       </w:r>
     </w:p>
     <w:p>
-      <w:pPr/>
-      <w:r>
-        <w:rPr>
-          <w:rFonts w:ascii="Helvetica" w:hAnsi="Helvetica" w:cs="Helvetica"/>
-          <w:sz w:val="24"/>
-          <w:sz-cs w:val="24"/>
-          <w:spacing w:val="0"/>
-        </w:rPr>
-        <w:t xml:space="preserve">本合同作为示例文档，演示 docx 模板填充能力。</w:t>
+      <w:r>
+        <w:rPr>
+          <w:rFonts w:ascii="Helvetica" w:hAnsi="Helvetica" w:cs="Helvetica"/>
+          <w:spacing w:val="0"/>
+          <w:sz w:val="24"/>
+        </w:rPr>
+        <w:t>本合同作为示例</w:t>
+      </w:r>
+      <w:bookmarkStart w:id="0" w:name="_GoBack"/>
+      <w:bookmarkEnd w:id="0"/>
+      <w:r>
+        <w:rPr>
+          <w:rFonts w:ascii="Helvetica" w:hAnsi="Helvetica" w:cs="Helvetica"/>
+          <w:spacing w:val="0"/>
+          <w:sz w:val="24"/>
+        </w:rPr>
+        <w:t>文档，演示 docx 模板填充能力。</w:t>
       </w:r>
     </w:p>
-    <w:sectPr/>
+    <w:sectPr>
+      <w:cols w:space="720" w:num="1"/>
+    </w:sectPr>
   </w:body>
 </w:document>
+</file>
+
+<file path=word/styles.xml><?xml version="1.0" encoding="utf-8"?>
+<w:styles xmlns:mc="http://schemas.openxmlformats.org/markup-compatibility/2006" xmlns:o="urn:schemas-microsoft-com:office:office" xmlns:r="http://schemas.openxmlformats.org/officeDocument/2006/relationships" xmlns:m="http://schemas.openxmlformats.org/officeDocument/2006/math" xmlns:v="urn:schemas-microsoft-com:vml" xmlns:w="http://schemas.openxmlformats.org/wordprocessingml/2006/main" xmlns:w14="http://schemas.microsoft.com/office/word/2010/wordml" xmlns:w10="urn:schemas-microsoft-com:office:word" xmlns:sl="http://schemas.openxmlformats.org/schemaLibrary/2006/main" xmlns:wpsCustomData="http://www.wps.cn/officeDocument/2013/wpsCustomData" mc:Ignorable="w14">
+  <w:docDefaults>
+    <w:rPrDefault>
+      <w:rPr>
+        <w:rFonts w:asciiTheme="minorHAnsi" w:hAnsiTheme="minorHAnsi" w:eastAsiaTheme="minorEastAsia" w:cstheme="minorBidi"/>
+      </w:rPr>
+    </w:rPrDefault>
+    <w:pPrDefault/>
+  </w:docDefaults>
+  <w:latentStyles w:count="260" w:defQFormat="0" w:defUnhideWhenUsed="1" w:defSemiHidden="1" w:defUIPriority="99" w:defLockedState="0">
+    <w:lsdException w:qFormat="1" w:unhideWhenUsed="0" w:uiPriority="0" w:semiHidden="0" w:name="Normal"/>
+    <w:lsdException w:qFormat="1" w:unhideWhenUsed="0" w:uiPriority="0" w:semiHidden="0" w:name="heading 1"/>
+    <w:lsdException w:qFormat="1" w:uiPriority="0" w:name="heading 2"/>
+    <w:lsdException w:qFormat="1" w:uiPriority="0" w:name="heading 3"/>
+    <w:lsdException w:qFormat="1" w:uiPriority="0" w:name="heading 4"/>
+    <w:lsdException w:qFormat="1" w:uiPriority="0" w:name="heading 5"/>
+    <w:lsdException w:qFormat="1" w:uiPriority="0" w:name="heading 6"/>
+    <w:lsdException w:qFormat="1" w:uiPriority="0" w:name="heading 7"/>
+    <w:lsdException w:qFormat="1" w:uiPriority="0" w:name="heading 8"/>
+    <w:lsdException w:qFormat="1" w:uiPriority="0" w:name="heading 9"/>
+    <w:lsdException w:unhideWhenUsed="0" w:uiPriority="0" w:semiHidden="0" w:name="index 1"/>
+    <w:lsdException w:unhideWhenUsed="0" w:uiPriority="0" w:semiHidden="0" w:name="index 2"/>
+    <w:lsdException w:unhideWhenUsed="0" w:uiPriority="0" w:semiHidden="0" w:name="index 3"/>
+    <w:lsdException w:unhideWhenUsed="0" w:uiPriority="0" w:semiHidden="0" w:name="index 4"/>
+    <w:lsdException w:unhideWhenUsed="0" w:uiPriority="0" w:semiHidden="0" w:name="index 5"/>
+    <w:lsdException w:unhideWhenUsed="0" w:uiPriority="0" w:semiHidden="0" w:name="index 6"/>
+    <w:lsdException w:unhideWhenUsed="0" w:uiPriority="0" w:semiHidden="0" w:name="index 7"/>
+    <w:lsdException w:unhideWhenUsed="0" w:uiPriority="0" w:semiHidden="0" w:name="index 8"/>
+    <w:lsdException w:unhideWhenUsed="0" w:uiPriority="0" w:semiHidden="0" w:name="index 9"/>
+    <w:lsdException w:unhideWhenUsed="0" w:uiPriority="0" w:semiHidden="0" w:name="toc 1"/>
+    <w:lsdException w:unhideWhenUsed="0" w:uiPriority="0" w:semiHidden="0" w:name="toc 2"/>
+    <w:lsdException w:unhideWhenUsed="0" w:uiPriority="0" w:semiHidden="0" w:name="toc 3"/>
+    <w:lsdException w:unhideWhenUsed="0" w:uiPriority="0" w:semiHidden="0" w:name="toc 4"/>
+    <w:lsdException w:unhideWhenUsed="0" w:uiPriority="0" w:semiHidden="0" w:name="toc 5"/>
+    <w:lsdException w:unhideWhenUsed="0" w:uiPriority="0" w:semiHidden="0" w:name="toc 6"/>
+    <w:lsdException w:unhideWhenUsed="0" w:uiPriority="0" w:semiHidden="0" w:name="toc 7"/>
+    <w:lsdException w:unhideWhenUsed="0" w:uiPriority="0" w:semiHidden="0" w:name="toc 8"/>
+    <w:lsdException w:unhideWhenUsed="0" w:uiPriority="0" w:semiHidden="0" w:name="toc 9"/>
+    <w:lsdException w:unhideWhenUsed="0" w:uiPriority="0" w:semiHidden="0" w:name="Normal Indent"/>
+    <w:lsdException w:unhideWhenUsed="0" w:uiPriority="0" w:semiHidden="0" w:name="footnote text"/>
+    <w:lsdException w:unhideWhenUsed="0" w:uiPriority="0" w:semiHidden="0" w:name="annotation text"/>
+    <w:lsdException w:unhideWhenUsed="0" w:uiPriority="0" w:semiHidden="0" w:name="header"/>
+    <w:lsdException w:unhideWhenUsed="0" w:uiPriority="0" w:semiHidden="0" w:name="footer"/>
+    <w:lsdException w:unhideWhenUsed="0" w:uiPriority="0" w:semiHidden="0" w:name="index heading"/>
+    <w:lsdException w:qFormat="1" w:uiPriority="0" w:name="caption"/>
+    <w:lsdException w:unhideWhenUsed="0" w:uiPriority="0" w:semiHidden="0" w:name="table of figures"/>
+    <w:lsdException w:unhideWhenUsed="0" w:uiPriority="0" w:semiHidden="0" w:name="envelope address"/>
+    <w:lsdException w:unhideWhenUsed="0" w:uiPriority="0" w:semiHidden="0" w:name="envelope return"/>
+    <w:lsdException w:unhideWhenUsed="0" w:uiPriority="0" w:semiHidden="0" w:name="footnote reference"/>
+    <w:lsdException w:unhideWhenUsed="0" w:uiPriority="0" w:semiHidden="0" w:name="annotation reference"/>
+    <w:lsdException w:unhideWhenUsed="0" w:uiPriority="0" w:semiHidden="0" w:name="line number"/>
+    <w:lsdException w:unhideWhenUsed="0" w:uiPriority="0" w:semiHidden="0" w:name="page number"/>
+    <w:lsdException w:unhideWhenUsed="0" w:uiPriority="0" w:semiHidden="0" w:name="endnote reference"/>
+    <w:lsdException w:unhideWhenUsed="0" w:uiPriority="0" w:semiHidden="0" w:name="endnote text"/>
+    <w:lsdException w:unhideWhenUsed="0" w:uiPriority="0" w:semiHidden="0" w:name="table of authorities"/>
+    <w:lsdException w:unhideWhenUsed="0" w:uiPriority="0" w:semiHidden="0" w:name="macro"/>
+    <w:lsdException w:unhideWhenUsed="0" w:uiPriority="0" w:semiHidden="0" w:name="toa heading"/>
+    <w:lsdException w:unhideWhenUsed="0" w:uiPriority="0" w:semiHidden="0" w:name="List"/>
+    <w:lsdException w:unhideWhenUsed="0" w:uiPriority="0" w:semiHidden="0" w:name="List Bullet"/>
+    <w:lsdException w:unhideWhenUsed="0" w:uiPriority="0" w:semiHidden="0" w:name="List Number"/>
+    <w:lsdException w:unhideWhenUsed="0" w:uiPriority="0" w:semiHidden="0" w:name="List 2"/>
+    <w:lsdException w:unhideWhenUsed="0" w:uiPriority="0" w:semiHidden="0" w:name="List 3"/>
+    <w:lsdException w:unhideWhenUsed="0" w:uiPriority="0" w:semiHidden="0" w:name="List 4"/>
+    <w:lsdException w:unhideWhenUsed="0" w:uiPriority="0" w:semiHidden="0" w:name="List 5"/>
+    <w:lsdException w:unhideWhenUsed="0" w:uiPriority="0" w:semiHidden="0" w:name="List Bullet 2"/>
+    <w:lsdException w:unhideWhenUsed="0" w:uiPriority="0" w:semiHidden="0" w:name="List Bullet 3"/>
+    <w:lsdException w:unhideWhenUsed="0" w:uiPriority="0" w:semiHidden="0" w:name="List Bullet 4"/>
+    <w:lsdException w:unhideWhenUsed="0" w:uiPriority="0" w:semiHidden="0" w:name="List Bullet 5"/>
+    <w:lsdException w:unhideWhenUsed="0" w:uiPriority="0" w:semiHidden="0" w:name="List Number 2"/>
+    <w:lsdException w:unhideWhenUsed="0" w:uiPriority="0" w:semiHidden="0" w:name="List Number 3"/>
+    <w:lsdException w:unhideWhenUsed="0" w:uiPriority="0" w:semiHidden="0" w:name="List Number 4"/>
+    <w:lsdException w:unhideWhenUsed="0" w:uiPriority="0" w:semiHidden="0" w:name="List Number 5"/>
+    <w:lsdException w:qFormat="1" w:unhideWhenUsed="0" w:uiPriority="0" w:semiHidden="0" w:name="Title"/>
+    <w:lsdException w:unhideWhenUsed="0" w:uiPriority="0" w:semiHidden="0" w:name="Closing"/>
+    <w:lsdException w:unhideWhenUsed="0" w:uiPriority="0" w:semiHidden="0" w:name="Signature"/>
+    <w:lsdException w:unhideWhenUsed="0" w:uiPriority="0" w:name="Default Paragraph Font"/>
+    <w:lsdException w:unhideWhenUsed="0" w:uiPriority="0" w:semiHidden="0" w:name="Body Text"/>
+    <w:lsdException w:unhideWhenUsed="0" w:uiPriority="0" w:semiHidden="0" w:name="Body Text Indent"/>
+    <w:lsdException w:unhideWhenUsed="0" w:uiPriority="0" w:semiHidden="0" w:name="List Continue"/>
+    <w:lsdException w:unhideWhenUsed="0" w:uiPriority="0" w:semiHidden="0" w:name="List Continue 2"/>
+    <w:lsdException w:unhideWhenUsed="0" w:uiPriority="0" w:semiHidden="0" w:name="List Continue 3"/>
+    <w:lsdException w:unhideWhenUsed="0" w:uiPriority="0" w:semiHidden="0" w:name="List Continue 4"/>
+    <w:lsdException w:unhideWhenUsed="0" w:uiPriority="0" w:semiHidden="0" w:name="List Continue 5"/>
+    <w:lsdException w:unhideWhenUsed="0" w:uiPriority="0" w:semiHidden="0" w:name="Message Header"/>
+    <w:lsdException w:qFormat="1" w:unhideWhenUsed="0" w:uiPriority="0" w:semiHidden="0" w:name="Subtitle"/>
+    <w:lsdException w:unhideWhenUsed="0" w:uiPriority="0" w:semiHidden="0" w:name="Salutation"/>
+    <w:lsdException w:unhideWhenUsed="0" w:uiPriority="0" w:semiHidden="0" w:name="Date"/>
+    <w:lsdException w:unhideWhenUsed="0" w:uiPriority="0" w:semiHidden="0" w:name="Body Text First Indent"/>
+    <w:lsdException w:unhideWhenUsed="0" w:uiPriority="0" w:semiHidden="0" w:name="Body Text First Indent 2"/>
+    <w:lsdException w:unhideWhenUsed="0" w:uiPriority="0" w:semiHidden="0" w:name="Note Heading"/>
+    <w:lsdException w:unhideWhenUsed="0" w:uiPriority="0" w:semiHidden="0" w:name="Body Text 2"/>
+    <w:lsdException w:unhideWhenUsed="0" w:uiPriority="0" w:semiHidden="0" w:name="Body Text 3"/>
+    <w:lsdException w:unhideWhenUsed="0" w:uiPriority="0" w:semiHidden="0" w:name="Body Text Indent 2"/>
+    <w:lsdException w:unhideWhenUsed="0" w:uiPriority="0" w:semiHidden="0" w:name="Body Text Indent 3"/>
+    <w:lsdException w:unhideWhenUsed="0" w:uiPriority="0" w:semiHidden="0" w:name="Block Text"/>
+    <w:lsdException w:unhideWhenUsed="0" w:uiPriority="0" w:semiHidden="0" w:name="Hyperlink"/>
+    <w:lsdException w:unhideWhenUsed="0" w:uiPriority="0" w:semiHidden="0" w:name="FollowedHyperlink"/>
+    <w:lsdException w:qFormat="1" w:unhideWhenUsed="0" w:uiPriority="0" w:semiHidden="0" w:name="Strong"/>
+    <w:lsdException w:qFormat="1" w:unhideWhenUsed="0" w:uiPriority="0" w:semiHidden="0" w:name="Emphasis"/>
+    <w:lsdException w:unhideWhenUsed="0" w:uiPriority="0" w:semiHidden="0" w:name="Document Map"/>
+    <w:lsdException w:unhideWhenUsed="0" w:uiPriority="0" w:semiHidden="0" w:name="Plain Text"/>
+    <w:lsdException w:unhideWhenUsed="0" w:uiPriority="0" w:semiHidden="0" w:name="E-mail Signature"/>
+    <w:lsdException w:unhideWhenUsed="0" w:uiPriority="0" w:semiHidden="0" w:name="Normal (Web)"/>
+    <w:lsdException w:unhideWhenUsed="0" w:uiPriority="0" w:semiHidden="0" w:name="HTML Acronym"/>
+    <w:lsdException w:unhideWhenUsed="0" w:uiPriority="0" w:semiHidden="0" w:name="HTML Address"/>
+    <w:lsdException w:unhideWhenUsed="0" w:uiPriority="0" w:semiHidden="0" w:name="HTML Cite"/>
+    <w:lsdException w:unhideWhenUsed="0" w:uiPriority="0" w:semiHidden="0" w:name="HTML Code"/>
+    <w:lsdException w:unhideWhenUsed="0" w:uiPriority="0" w:semiHidden="0" w:name="HTML Definition"/>
+    <w:lsdException w:unhideWhenUsed="0" w:uiPriority="0" w:semiHidden="0" w:name="HTML Keyboard"/>
+    <w:lsdException w:unhideWhenUsed="0" w:uiPriority="0" w:semiHidden="0" w:name="HTML Preformatted"/>
+    <w:lsdException w:unhideWhenUsed="0" w:uiPriority="0" w:semiHidden="0" w:name="HTML Sample"/>
+    <w:lsdException w:unhideWhenUsed="0" w:uiPriority="0" w:semiHidden="0" w:name="HTML Typewriter"/>
+    <w:lsdException w:unhideWhenUsed="0" w:uiPriority="0" w:semiHidden="0" w:name="HTML Variable"/>
+    <w:lsdException w:unhideWhenUsed="0" w:uiPriority="0" w:name="Normal Table"/>
+    <w:lsdException w:unhideWhenUsed="0" w:uiPriority="0" w:semiHidden="0" w:name="annotation subject"/>
+    <w:lsdException w:unhideWhenUsed="0" w:uiPriority="0" w:semiHidden="0" w:name="Table Simple 1"/>
+    <w:lsdException w:unhideWhenUsed="0" w:uiPriority="0" w:semiHidden="0" w:name="Table Simple 2"/>
+    <w:lsdException w:unhideWhenUsed="0" w:uiPriority="0" w:semiHidden="0" w:name="Table Simple 3"/>
+    <w:lsdException w:unhideWhenUsed="0" w:uiPriority="0" w:semiHidden="0" w:name="Table Classic 1"/>
+    <w:lsdException w:unhideWhenUsed="0" w:uiPriority="0" w:semiHidden="0" w:name="Table Classic 2"/>
+    <w:lsdException w:unhideWhenUsed="0" w:uiPriority="0" w:semiHidden="0" w:name="Table Classic 3"/>
+    <w:lsdException w:unhideWhenUsed="0" w:uiPriority="0" w:semiHidden="0" w:name="Table Classic 4"/>
+    <w:lsdException w:unhideWhenUsed="0" w:uiPriority="0" w:semiHidden="0" w:name="Table Colorful 1"/>
+    <w:lsdException w:unhideWhenUsed="0" w:uiPriority="0" w:semiHidden="0" w:name="Table Colorful 2"/>
+    <w:lsdException w:unhideWhenUsed="0" w:uiPriority="0" w:semiHidden="0" w:name="Table Colorful 3"/>
+    <w:lsdException w:unhideWhenUsed="0" w:uiPriority="0" w:semiHidden="0" w:name="Table Columns 1"/>
+    <w:lsdException w:unhideWhenUsed="0" w:uiPriority="0" w:semiHidden="0" w:name="Table Columns 2"/>
+    <w:lsdException w:unhideWhenUsed="0" w:uiPriority="0" w:semiHidden="0" w:name="Table Columns 3"/>
+    <w:lsdException w:unhideWhenUsed="0" w:uiPriority="0" w:semiHidden="0" w:name="Table Columns 4"/>
+    <w:lsdException w:unhideWhenUsed="0" w:uiPriority="0" w:semiHidden="0" w:name="Table Columns 5"/>
+    <w:lsdException w:unhideWhenUsed="0" w:uiPriority="0" w:semiHidden="0" w:name="Table Grid 1"/>
+    <w:lsdException w:unhideWhenUsed="0" w:uiPriority="0" w:semiHidden="0" w:name="Table Grid 2"/>
+    <w:lsdException w:unhideWhenUsed="0" w:uiPriority="0" w:semiHidden="0" w:name="Table Grid 3"/>
+    <w:lsdException w:unhideWhenUsed="0" w:uiPriority="0" w:semiHidden="0" w:name="Table Grid 4"/>
+    <w:lsdException w:unhideWhenUsed="0" w:uiPriority="0" w:semiHidden="0" w:name="Table Grid 5"/>
+    <w:lsdException w:unhideWhenUsed="0" w:uiPriority="0" w:semiHidden="0" w:name="Table Grid 6"/>
+    <w:lsdException w:unhideWhenUsed="0" w:uiPriority="0" w:semiHidden="0" w:name="Table Grid 7"/>
+    <w:lsdException w:unhideWhenUsed="0" w:uiPriority="0" w:semiHidden="0" w:name="Table Grid 8"/>
+    <w:lsdException w:unhideWhenUsed="0" w:uiPriority="0" w:semiHidden="0" w:name="Table List 1"/>
+    <w:lsdException w:unhideWhenUsed="0" w:uiPriority="0" w:semiHidden="0" w:name="Table List 2"/>
+    <w:lsdException w:unhideWhenUsed="0" w:uiPriority="0" w:semiHidden="0" w:name="Table List 3"/>
+    <w:lsdException w:unhideWhenUsed="0" w:uiPriority="0" w:semiHidden="0" w:name="Table List 4"/>
+    <w:lsdException w:unhideWhenUsed="0" w:uiPriority="0" w:semiHidden="0" w:name="Table List 5"/>
+    <w:lsdException w:unhideWhenUsed="0" w:uiPriority="0" w:semiHidden="0" w:name="Table List 6"/>
+    <w:lsdException w:unhideWhenUsed="0" w:uiPriority="0" w:semiHidden="0" w:name="Table List 7"/>
+    <w:lsdException w:unhideWhenUsed="0" w:uiPriority="0" w:semiHidden="0" w:name="Table List 8"/>
+    <w:lsdException w:unhideWhenUsed="0" w:uiPriority="0" w:semiHidden="0" w:name="Table 3D effects 1"/>
+    <w:lsdException w:unhideWhenUsed="0" w:uiPriority="0" w:semiHidden="0" w:name="Table 3D effects 2"/>
+    <w:lsdException w:unhideWhenUsed="0" w:uiPriority="0" w:semiHidden="0" w:name="Table 3D effects 3"/>
+    <w:lsdException w:unhideWhenUsed="0" w:uiPriority="0" w:semiHidden="0" w:name="Table Contemporary"/>
+    <w:lsdException w:unhideWhenUsed="0" w:uiPriority="0" w:semiHidden="0" w:name="Table Elegant"/>
+    <w:lsdException w:unhideWhenUsed="0" w:uiPriority="0" w:semiHidden="0" w:name="Table Professional"/>
+    <w:lsdException w:unhideWhenUsed="0" w:uiPriority="0" w:semiHidden="0" w:name="Table Subtle 1"/>
+    <w:lsdException w:unhideWhenUsed="0" w:uiPriority="0" w:semiHidden="0" w:name="Table Subtle 2"/>
+    <w:lsdException w:unhideWhenUsed="0" w:uiPriority="0" w:semiHidden="0" w:name="Table Web 1"/>
+    <w:lsdException w:unhideWhenUsed="0" w:uiPriority="0" w:semiHidden="0" w:name="Table Web 2"/>
+    <w:lsdException w:unhideWhenUsed="0" w:uiPriority="0" w:semiHidden="0" w:name="Table Web 3"/>
+    <w:lsdException w:unhideWhenUsed="0" w:uiPriority="0" w:semiHidden="0" w:name="Balloon Text"/>
+    <w:lsdException w:unhideWhenUsed="0" w:uiPriority="0" w:semiHidden="0" w:name="Table Grid"/>
+    <w:lsdException w:unhideWhenUsed="0" w:uiPriority="0" w:semiHidden="0" w:name="Table Theme"/>
+    <w:lsdException w:unhideWhenUsed="0" w:uiPriority="60" w:semiHidden="0" w:name="Light Shading"/>
+    <w:lsdException w:unhideWhenUsed="0" w:uiPriority="61" w:semiHidden="0" w:name="Light List"/>
+    <w:lsdException w:unhideWhenUsed="0" w:uiPriority="62" w:semiHidden="0" w:name="Light Grid"/>
+    <w:lsdException w:unhideWhenUsed="0" w:uiPriority="63" w:semiHidden="0" w:name="Medium Shading 1"/>
+    <w:lsdException w:unhideWhenUsed="0" w:uiPriority="64" w:semiHidden="0" w:name="Medium Shading 2"/>
+    <w:lsdException w:unhideWhenUsed="0" w:uiPriority="65" w:semiHidden="0" w:name="Medium List 1"/>
+    <w:lsdException w:unhideWhenUsed="0" w:uiPriority="66" w:semiHidden="0" w:name="Medium List 2"/>
+    <w:lsdException w:unhideWhenUsed="0" w:uiPriority="67" w:semiHidden="0" w:name="Medium Grid 1"/>
+    <w:lsdException w:unhideWhenUsed="0" w:uiPriority="68" w:semiHidden="0" w:name="Medium Grid 2"/>
+    <w:lsdException w:unhideWhenUsed="0" w:uiPriority="69" w:semiHidden="0" w:name="Medium Grid 3"/>
+    <w:lsdException w:unhideWhenUsed="0" w:uiPriority="70" w:semiHidden="0" w:name="Dark List"/>
+    <w:lsdException w:unhideWhenUsed="0" w:uiPriority="71" w:semiHidden="0" w:name="Colorful Shading"/>
+    <w:lsdException w:unhideWhenUsed="0" w:uiPriority="72" w:semiHidden="0" w:name="Colorful List"/>
+    <w:lsdException w:unhideWhenUsed="0" w:uiPriority="73" w:semiHidden="0" w:name="Colorful Grid"/>
+    <w:lsdException w:unhideWhenUsed="0" w:uiPriority="60" w:semiHidden="0" w:name="Light Shading Accent 1"/>
+    <w:lsdException w:unhideWhenUsed="0" w:uiPriority="61" w:semiHidden="0" w:name="Light List Accent 1"/>
+    <w:lsdException w:unhideWhenUsed="0" w:uiPriority="62" w:semiHidden="0" w:name="Light Grid Accent 1"/>
+    <w:lsdException w:unhideWhenUsed="0" w:uiPriority="63" w:semiHidden="0" w:name="Medium Shading 1 Accent 1"/>
+    <w:lsdException w:unhideWhenUsed="0" w:uiPriority="64" w:semiHidden="0" w:name="Medium Shading 2 Accent 1"/>
+    <w:lsdException w:unhideWhenUsed="0" w:uiPriority="65" w:semiHidden="0" w:name="Medium List 1 Accent 1"/>
+    <w:lsdException w:unhideWhenUsed="0" w:uiPriority="66" w:semiHidden="0" w:name="Medium List 2 Accent 1"/>
+    <w:lsdException w:unhideWhenUsed="0" w:uiPriority="67" w:semiHidden="0" w:name="Medium Grid 1 Accent 1"/>
+    <w:lsdException w:unhideWhenUsed="0" w:uiPriority="68" w:semiHidden="0" w:name="Medium Grid 2 Accent 1"/>
+    <w:lsdException w:unhideWhenUsed="0" w:uiPriority="69" w:semiHidden="0" w:name="Medium Grid 3 Accent 1"/>
+    <w:lsdException w:unhideWhenUsed="0" w:uiPriority="70" w:semiHidden="0" w:name="Dark List Accent 1"/>
+    <w:lsdException w:unhideWhenUsed="0" w:uiPriority="71" w:semiHidden="0" w:name="Colorful Shading Accent 1"/>
+    <w:lsdException w:unhideWhenUsed="0" w:uiPriority="72" w:semiHidden="0" w:name="Colorful List Accent 1"/>
+    <w:lsdException w:unhideWhenUsed="0" w:uiPriority="73" w:semiHidden="0" w:name="Colorful Grid Accent 1"/>
+    <w:lsdException w:unhideWhenUsed="0" w:uiPriority="60" w:semiHidden="0" w:name="Light Shading Accent 2"/>
+    <w:lsdException w:unhideWhenUsed="0" w:uiPriority="61" w:semiHidden="0" w:name="Light List Accent 2"/>
+    <w:lsdException w:unhideWhenUsed="0" w:uiPriority="62" w:semiHidden="0" w:name="Light Grid Accent 2"/>
+    <w:lsdException w:unhideWhenUsed="0" w:uiPriority="63" w:semiHidden="0" w:name="Medium Shading 1 Accent 2"/>
+    <w:lsdException w:unhideWhenUsed="0" w:uiPriority="64" w:semiHidden="0" w:name="Medium Shading 2 Accent 2"/>
+    <w:lsdException w:unhideWhenUsed="0" w:uiPriority="65" w:semiHidden="0" w:name="Medium List 1 Accent 2"/>
+    <w:lsdException w:unhideWhenUsed="0" w:uiPriority="66" w:semiHidden="0" w:name="Medium List 2 Accent 2"/>
+    <w:lsdException w:unhideWhenUsed="0" w:uiPriority="67" w:semiHidden="0" w:name="Medium Grid 1 Accent 2"/>
+    <w:lsdException w:unhideWhenUsed="0" w:uiPriority="68" w:semiHidden="0" w:name="Medium Grid 2 Accent 2"/>
+    <w:lsdException w:unhideWhenUsed="0" w:uiPriority="69" w:semiHidden="0" w:name="Medium Grid 3 Accent 2"/>
+    <w:lsdException w:unhideWhenUsed="0" w:uiPriority="70" w:semiHidden="0" w:name="Dark List Accent 2"/>
+    <w:lsdException w:unhideWhenUsed="0" w:uiPriority="71" w:semiHidden="0" w:name="Colorful Shading Accent 2"/>
+    <w:lsdException w:unhideWhenUsed="0" w:uiPriority="72" w:semiHidden="0" w:name="Colorful List Accent 2"/>
+    <w:lsdException w:unhideWhenUsed="0" w:uiPriority="73" w:semiHidden="0" w:name="Colorful Grid Accent 2"/>
+    <w:lsdException w:unhideWhenUsed="0" w:uiPriority="60" w:semiHidden="0" w:name="Light Shading Accent 3"/>
+    <w:lsdException w:unhideWhenUsed="0" w:uiPriority="61" w:semiHidden="0" w:name="Light List Accent 3"/>
+    <w:lsdException w:unhideWhenUsed="0" w:uiPriority="62" w:semiHidden="0" w:name="Light Grid Accent 3"/>
+    <w:lsdException w:unhideWhenUsed="0" w:uiPriority="63" w:semiHidden="0" w:name="Medium Shading 1 Accent 3"/>
+    <w:lsdException w:unhideWhenUsed="0" w:uiPriority="64" w:semiHidden="0" w:name="Medium Shading 2 Accent 3"/>
+    <w:lsdException w:unhideWhenUsed="0" w:uiPriority="65" w:semiHidden="0" w:name="Medium List 1 Accent 3"/>
+    <w:lsdException w:unhideWhenUsed="0" w:uiPriority="66" w:semiHidden="0" w:name="Medium List 2 Accent 3"/>
+    <w:lsdException w:unhideWhenUsed="0" w:uiPriority="67" w:semiHidden="0" w:name="Medium Grid 1 Accent 3"/>
+    <w:lsdException w:unhideWhenUsed="0" w:uiPriority="68" w:semiHidden="0" w:name="Medium Grid 2 Accent 3"/>
+    <w:lsdException w:unhideWhenUsed="0" w:uiPriority="69" w:semiHidden="0" w:name="Medium Grid 3 Accent 3"/>
+    <w:lsdException w:unhideWhenUsed="0" w:uiPriority="70" w:semiHidden="0" w:name="Dark List Accent 3"/>
+    <w:lsdException w:unhideWhenUsed="0" w:uiPriority="71" w:semiHidden="0" w:name="Colorful Shading Accent 3"/>
+    <w:lsdException w:unhideWhenUsed="0" w:uiPriority="72" w:semiHidden="0" w:name="Colorful List Accent 3"/>
+    <w:lsdException w:unhideWhenUsed="0" w:uiPriority="73" w:semiHidden="0" w:name="Colorful Grid Accent 3"/>
+    <w:lsdException w:unhideWhenUsed="0" w:uiPriority="60" w:semiHidden="0" w:name="Light Shading Accent 4"/>
+    <w:lsdException w:unhideWhenUsed="0" w:uiPriority="61" w:semiHidden="0" w:name="Light List Accent 4"/>
+    <w:lsdException w:unhideWhenUsed="0" w:uiPriority="62" w:semiHidden="0" w:name="Light Grid Accent 4"/>
+    <w:lsdException w:unhideWhenUsed="0" w:uiPriority="63" w:semiHidden="0" w:name="Medium Shading 1 Accent 4"/>
+    <w:lsdException w:unhideWhenUsed="0" w:uiPriority="64" w:semiHidden="0" w:name="Medium Shading 2 Accent 4"/>
+    <w:lsdException w:unhideWhenUsed="0" w:uiPriority="65" w:semiHidden="0" w:name="Medium List 1 Accent 4"/>
+    <w:lsdException w:unhideWhenUsed="0" w:uiPriority="66" w:semiHidden="0" w:name="Medium List 2 Accent 4"/>
+    <w:lsdException w:unhideWhenUsed="0" w:uiPriority="67" w:semiHidden="0" w:name="Medium Grid 1 Accent 4"/>
+    <w:lsdException w:unhideWhenUsed="0" w:uiPriority="68" w:semiHidden="0" w:name="Medium Grid 2 Accent 4"/>
+    <w:lsdException w:unhideWhenUsed="0" w:uiPriority="69" w:semiHidden="0" w:name="Medium Grid 3 Accent 4"/>
+    <w:lsdException w:unhideWhenUsed="0" w:uiPriority="70" w:semiHidden="0" w:name="Dark List Accent 4"/>
+    <w:lsdException w:unhideWhenUsed="0" w:uiPriority="71" w:semiHidden="0" w:name="Colorful Shading Accent 4"/>
+    <w:lsdException w:unhideWhenUsed="0" w:uiPriority="72" w:semiHidden="0" w:name="Colorful List Accent 4"/>
+    <w:lsdException w:unhideWhenUsed="0" w:uiPriority="73" w:semiHidden="0" w:name="Colorful Grid Accent 4"/>
+    <w:lsdException w:unhideWhenUsed="0" w:uiPriority="60" w:semiHidden="0" w:name="Light Shading Accent 5"/>
+    <w:lsdException w:unhideWhenUsed="0" w:uiPriority="61" w:semiHidden="0" w:name="Light List Accent 5"/>
+    <w:lsdException w:unhideWhenUsed="0" w:uiPriority="62" w:semiHidden="0" w:name="Light Grid Accent 5"/>
+    <w:lsdException w:unhideWhenUsed="0" w:uiPriority="63" w:semiHidden="0" w:name="Medium Shading 1 Accent 5"/>
+    <w:lsdException w:unhideWhenUsed="0" w:uiPriority="64" w:semiHidden="0" w:name="Medium Shading 2 Accent 5"/>
+    <w:lsdException w:unhideWhenUsed="0" w:uiPriority="65" w:semiHidden="0" w:name="Medium List 1 Accent 5"/>
+    <w:lsdException w:unhideWhenUsed="0" w:uiPriority="66" w:semiHidden="0" w:name="Medium List 2 Accent 5"/>
+    <w:lsdException w:unhideWhenUsed="0" w:uiPriority="67" w:semiHidden="0" w:name="Medium Grid 1 Accent 5"/>
+    <w:lsdException w:unhideWhenUsed="0" w:uiPriority="68" w:semiHidden="0" w:name="Medium Grid 2 Accent 5"/>
+    <w:lsdException w:unhideWhenUsed="0" w:uiPriority="69" w:semiHidden="0" w:name="Medium Grid 3 Accent 5"/>
+    <w:lsdException w:unhideWhenUsed="0" w:uiPriority="70" w:semiHidden="0" w:name="Dark List Accent 5"/>
+    <w:lsdException w:unhideWhenUsed="0" w:uiPriority="71" w:semiHidden="0" w:name="Colorful Shading Accent 5"/>
+    <w:lsdException w:unhideWhenUsed="0" w:uiPriority="72" w:semiHidden="0" w:name="Colorful List Accent 5"/>
+    <w:lsdException w:unhideWhenUsed="0" w:uiPriority="73" w:semiHidden="0" w:name="Colorful Grid Accent 5"/>
+    <w:lsdException w:unhideWhenUsed="0" w:uiPriority="60" w:semiHidden="0" w:name="Light Shading Accent 6"/>
+    <w:lsdException w:unhideWhenUsed="0" w:uiPriority="61" w:semiHidden="0" w:name="Light List Accent 6"/>
+    <w:lsdException w:unhideWhenUsed="0" w:uiPriority="62" w:semiHidden="0" w:name="Light Grid Accent 6"/>
+    <w:lsdException w:unhideWhenUsed="0" w:uiPriority="63" w:semiHidden="0" w:name="Medium Shading 1 Accent 6"/>
+    <w:lsdException w:unhideWhenUsed="0" w:uiPriority="64" w:semiHidden="0" w:name="Medium Shading 2 Accent 6"/>
+    <w:lsdException w:unhideWhenUsed="0" w:uiPriority="65" w:semiHidden="0" w:name="Medium List 1 Accent 6"/>
+    <w:lsdException w:unhideWhenUsed="0" w:uiPriority="66" w:semiHidden="0" w:name="Medium List 2 Accent 6"/>
+    <w:lsdException w:unhideWhenUsed="0" w:uiPriority="67" w:semiHidden="0" w:name="Medium Grid 1 Accent 6"/>
+    <w:lsdException w:unhideWhenUsed="0" w:uiPriority="68" w:semiHidden="0" w:name="Medium Grid 2 Accent 6"/>
+    <w:lsdException w:unhideWhenUsed="0" w:uiPriority="69" w:semiHidden="0" w:name="Medium Grid 3 Accent 6"/>
+    <w:lsdException w:unhideWhenUsed="0" w:uiPriority="70" w:semiHidden="0" w:name="Dark List Accent 6"/>
+    <w:lsdException w:unhideWhenUsed="0" w:uiPriority="71" w:semiHidden="0" w:name="Colorful Shading Accent 6"/>
+    <w:lsdException w:unhideWhenUsed="0" w:uiPriority="72" w:semiHidden="0" w:name="Colorful List Accent 6"/>
+    <w:lsdException w:unhideWhenUsed="0" w:uiPriority="73" w:semiHidden="0" w:name="Colorful Grid Accent 6"/>
+  </w:latentStyles>
+  <w:style w:type="paragraph" w:default="1" w:styleId="1">
+    <w:name w:val="Normal"/>
+    <w:qFormat/>
+    <w:uiPriority w:val="0"/>
+    <w:rPr>
+      <w:sz w:val="21"/>
+      <w:szCs w:val="22"/>
+    </w:rPr>
+  </w:style>
+  <w:style w:type="character" w:default="1" w:styleId="2">
+    <w:name w:val="Default Paragraph Font"/>
+    <w:semiHidden/>
+    <w:uiPriority w:val="0"/>
+  </w:style>
+  <w:style w:type="table" w:default="1" w:styleId="3">
+    <w:name w:val="Normal Table"/>
+    <w:semiHidden/>
+    <w:uiPriority w:val="0"/>
+    <w:tblPr>
+      <w:tblCellMar>
+        <w:top w:w="0" w:type="dxa"/>
+        <w:left w:w="108" w:type="dxa"/>
+        <w:bottom w:w="0" w:type="dxa"/>
+        <w:right w:w="108" w:type="dxa"/>
+      </w:tblCellMar>
+    </w:tblPr>
+  </w:style>
+</w:styles>
 </file>
 
 <file path=word/theme/theme1.xml><?xml version="1.0" encoding="utf-8"?>
@@ -344,6 +654,5 @@
     </a:fmtScheme>
   </a:themeElements>
   <a:objectDefaults/>
-  <a:extraClrSchemeLst/>
 </a:theme>
 </file>
</xml_diff>